<commit_message>
Rename solution short name from PDD to PIDD
Aligns identifiers with the executive summary:
- TS-00 glossary entry
- TS-08 ITSM source field value
- TS-09 / TS-12 Kubernetes priority classes (pidd-critical, pidd-standard, pidd-batch)
- README title and spec-builder package name
Regenerated the four affected Word specifications.

Co-Authored-By: Claude Opus 5.5 <noreply@anthropic.com>
Claude-Session: https://claude.ai/code/session_01H5GtsTtg9dzXpCHCqAmZHQ
</commit_message>
<xml_diff>
--- a/docs/specifications/docx/TS-00_Specification_Set_Index_and_Conventions.docx
+++ b/docs/specifications/docx/TS-00_Specification_Set_Index_and_Conventions.docx
@@ -8376,8 +8376,8 @@
         </w:tblBorders>
       </w:tblPr>
       <w:tblGrid>
-        <w:gridCol w:w="2675"/>
-        <w:gridCol w:w="6963"/>
+        <w:gridCol w:w="2564"/>
+        <w:gridCol w:w="7074"/>
       </w:tblGrid>
       <w:tr>
         <w:trPr>
@@ -8386,7 +8386,7 @@
         </w:trPr>
         <w:tc>
           <w:tcPr>
-            <w:tcW w:type="dxa" w:w="2675"/>
+            <w:tcW w:type="dxa" w:w="2564"/>
             <w:tcBorders>
               <w:top w:val="single" w:color="BFC9D4" w:sz="4"/>
               <w:left w:val="single" w:color="BFC9D4" w:sz="4"/>
@@ -8419,7 +8419,7 @@
         </w:tc>
         <w:tc>
           <w:tcPr>
-            <w:tcW w:type="dxa" w:w="6963"/>
+            <w:tcW w:type="dxa" w:w="7074"/>
             <w:tcBorders>
               <w:top w:val="single" w:color="BFC9D4" w:sz="4"/>
               <w:left w:val="single" w:color="BFC9D4" w:sz="4"/>
@@ -8458,7 +8458,7 @@
         </w:trPr>
         <w:tc>
           <w:tcPr>
-            <w:tcW w:type="dxa" w:w="2675"/>
+            <w:tcW w:type="dxa" w:w="2564"/>
             <w:tcBorders>
               <w:top w:val="single" w:color="BFC9D4" w:sz="4"/>
               <w:left w:val="single" w:color="BFC9D4" w:sz="4"/>
@@ -8487,7 +8487,7 @@
         </w:tc>
         <w:tc>
           <w:tcPr>
-            <w:tcW w:type="dxa" w:w="6963"/>
+            <w:tcW w:type="dxa" w:w="7074"/>
             <w:tcBorders>
               <w:top w:val="single" w:color="BFC9D4" w:sz="4"/>
               <w:left w:val="single" w:color="BFC9D4" w:sz="4"/>
@@ -8522,61 +8522,61 @@
         </w:trPr>
         <w:tc>
           <w:tcPr>
-            <w:tcW w:type="dxa" w:w="2675"/>
-            <w:tcBorders>
-              <w:top w:val="single" w:color="BFC9D4" w:sz="4"/>
-              <w:left w:val="single" w:color="BFC9D4" w:sz="4"/>
-              <w:bottom w:val="single" w:color="BFC9D4" w:sz="4"/>
-              <w:right w:val="single" w:color="BFC9D4" w:sz="4"/>
-            </w:tcBorders>
-            <w:shd w:fill="F7F9FC" w:color="auto" w:val="clear"/>
-            <w:tcMar>
-              <w:top w:type="dxa" w:w="60"/>
-              <w:left w:type="dxa" w:w="100"/>
-              <w:bottom w:type="dxa" w:w="60"/>
-              <w:right w:type="dxa" w:w="100"/>
-            </w:tcMar>
-          </w:tcPr>
-          <w:p>
-            <w:pPr>
-              <w:spacing w:after="0" w:before="0" w:line="252"/>
-            </w:pPr>
-            <w:r>
-              <w:rPr>
-                <w:sz w:val="18"/>
-                <w:szCs w:val="18"/>
-              </w:rPr>
-              <w:t xml:space="preserve">PDD</w:t>
-            </w:r>
-          </w:p>
-        </w:tc>
-        <w:tc>
-          <w:tcPr>
-            <w:tcW w:type="dxa" w:w="6963"/>
-            <w:tcBorders>
-              <w:top w:val="single" w:color="BFC9D4" w:sz="4"/>
-              <w:left w:val="single" w:color="BFC9D4" w:sz="4"/>
-              <w:bottom w:val="single" w:color="BFC9D4" w:sz="4"/>
-              <w:right w:val="single" w:color="BFC9D4" w:sz="4"/>
-            </w:tcBorders>
-            <w:shd w:fill="F7F9FC" w:color="auto" w:val="clear"/>
-            <w:tcMar>
-              <w:top w:type="dxa" w:w="60"/>
-              <w:left w:type="dxa" w:w="100"/>
-              <w:bottom w:type="dxa" w:w="60"/>
-              <w:right w:type="dxa" w:w="100"/>
-            </w:tcMar>
-          </w:tcPr>
-          <w:p>
-            <w:pPr>
-              <w:spacing w:after="0" w:before="0" w:line="252"/>
-            </w:pPr>
-            <w:r>
-              <w:rPr>
-                <w:sz w:val="18"/>
-                <w:szCs w:val="18"/>
-              </w:rPr>
-              <w:t xml:space="preserve">Short name for this solution (Proactive Disruption Detection) used in identifiers, priority classes and ITSM source fields</w:t>
+            <w:tcW w:type="dxa" w:w="2564"/>
+            <w:tcBorders>
+              <w:top w:val="single" w:color="BFC9D4" w:sz="4"/>
+              <w:left w:val="single" w:color="BFC9D4" w:sz="4"/>
+              <w:bottom w:val="single" w:color="BFC9D4" w:sz="4"/>
+              <w:right w:val="single" w:color="BFC9D4" w:sz="4"/>
+            </w:tcBorders>
+            <w:shd w:fill="F7F9FC" w:color="auto" w:val="clear"/>
+            <w:tcMar>
+              <w:top w:type="dxa" w:w="60"/>
+              <w:left w:type="dxa" w:w="100"/>
+              <w:bottom w:type="dxa" w:w="60"/>
+              <w:right w:type="dxa" w:w="100"/>
+            </w:tcMar>
+          </w:tcPr>
+          <w:p>
+            <w:pPr>
+              <w:spacing w:after="0" w:before="0" w:line="252"/>
+            </w:pPr>
+            <w:r>
+              <w:rPr>
+                <w:sz w:val="18"/>
+                <w:szCs w:val="18"/>
+              </w:rPr>
+              <w:t xml:space="preserve">PIDD</w:t>
+            </w:r>
+          </w:p>
+        </w:tc>
+        <w:tc>
+          <w:tcPr>
+            <w:tcW w:type="dxa" w:w="7074"/>
+            <w:tcBorders>
+              <w:top w:val="single" w:color="BFC9D4" w:sz="4"/>
+              <w:left w:val="single" w:color="BFC9D4" w:sz="4"/>
+              <w:bottom w:val="single" w:color="BFC9D4" w:sz="4"/>
+              <w:right w:val="single" w:color="BFC9D4" w:sz="4"/>
+            </w:tcBorders>
+            <w:shd w:fill="F7F9FC" w:color="auto" w:val="clear"/>
+            <w:tcMar>
+              <w:top w:type="dxa" w:w="60"/>
+              <w:left w:type="dxa" w:w="100"/>
+              <w:bottom w:type="dxa" w:w="60"/>
+              <w:right w:type="dxa" w:w="100"/>
+            </w:tcMar>
+          </w:tcPr>
+          <w:p>
+            <w:pPr>
+              <w:spacing w:after="0" w:before="0" w:line="252"/>
+            </w:pPr>
+            <w:r>
+              <w:rPr>
+                <w:sz w:val="18"/>
+                <w:szCs w:val="18"/>
+              </w:rPr>
+              <w:t xml:space="preserve">Short name for this solution (Proactive Infrastructure Disruption Detection) used in identifiers, priority classes and ITSM source fields</w:t>
             </w:r>
           </w:p>
         </w:tc>
@@ -8588,7 +8588,7 @@
         </w:trPr>
         <w:tc>
           <w:tcPr>
-            <w:tcW w:type="dxa" w:w="2675"/>
+            <w:tcW w:type="dxa" w:w="2564"/>
             <w:tcBorders>
               <w:top w:val="single" w:color="BFC9D4" w:sz="4"/>
               <w:left w:val="single" w:color="BFC9D4" w:sz="4"/>
@@ -8617,7 +8617,7 @@
         </w:tc>
         <w:tc>
           <w:tcPr>
-            <w:tcW w:type="dxa" w:w="6963"/>
+            <w:tcW w:type="dxa" w:w="7074"/>
             <w:tcBorders>
               <w:top w:val="single" w:color="BFC9D4" w:sz="4"/>
               <w:left w:val="single" w:color="BFC9D4" w:sz="4"/>
@@ -8652,7 +8652,7 @@
         </w:trPr>
         <w:tc>
           <w:tcPr>
-            <w:tcW w:type="dxa" w:w="2675"/>
+            <w:tcW w:type="dxa" w:w="2564"/>
             <w:tcBorders>
               <w:top w:val="single" w:color="BFC9D4" w:sz="4"/>
               <w:left w:val="single" w:color="BFC9D4" w:sz="4"/>
@@ -8682,7 +8682,7 @@
         </w:tc>
         <w:tc>
           <w:tcPr>
-            <w:tcW w:type="dxa" w:w="6963"/>
+            <w:tcW w:type="dxa" w:w="7074"/>
             <w:tcBorders>
               <w:top w:val="single" w:color="BFC9D4" w:sz="4"/>
               <w:left w:val="single" w:color="BFC9D4" w:sz="4"/>
@@ -8718,7 +8718,7 @@
         </w:trPr>
         <w:tc>
           <w:tcPr>
-            <w:tcW w:type="dxa" w:w="2675"/>
+            <w:tcW w:type="dxa" w:w="2564"/>
             <w:tcBorders>
               <w:top w:val="single" w:color="BFC9D4" w:sz="4"/>
               <w:left w:val="single" w:color="BFC9D4" w:sz="4"/>
@@ -8747,7 +8747,7 @@
         </w:tc>
         <w:tc>
           <w:tcPr>
-            <w:tcW w:type="dxa" w:w="6963"/>
+            <w:tcW w:type="dxa" w:w="7074"/>
             <w:tcBorders>
               <w:top w:val="single" w:color="BFC9D4" w:sz="4"/>
               <w:left w:val="single" w:color="BFC9D4" w:sz="4"/>
@@ -8782,7 +8782,7 @@
         </w:trPr>
         <w:tc>
           <w:tcPr>
-            <w:tcW w:type="dxa" w:w="2675"/>
+            <w:tcW w:type="dxa" w:w="2564"/>
             <w:tcBorders>
               <w:top w:val="single" w:color="BFC9D4" w:sz="4"/>
               <w:left w:val="single" w:color="BFC9D4" w:sz="4"/>
@@ -8812,7 +8812,7 @@
         </w:tc>
         <w:tc>
           <w:tcPr>
-            <w:tcW w:type="dxa" w:w="6963"/>
+            <w:tcW w:type="dxa" w:w="7074"/>
             <w:tcBorders>
               <w:top w:val="single" w:color="BFC9D4" w:sz="4"/>
               <w:left w:val="single" w:color="BFC9D4" w:sz="4"/>
@@ -8848,7 +8848,7 @@
         </w:trPr>
         <w:tc>
           <w:tcPr>
-            <w:tcW w:type="dxa" w:w="2675"/>
+            <w:tcW w:type="dxa" w:w="2564"/>
             <w:tcBorders>
               <w:top w:val="single" w:color="BFC9D4" w:sz="4"/>
               <w:left w:val="single" w:color="BFC9D4" w:sz="4"/>
@@ -8877,7 +8877,7 @@
         </w:tc>
         <w:tc>
           <w:tcPr>
-            <w:tcW w:type="dxa" w:w="6963"/>
+            <w:tcW w:type="dxa" w:w="7074"/>
             <w:tcBorders>
               <w:top w:val="single" w:color="BFC9D4" w:sz="4"/>
               <w:left w:val="single" w:color="BFC9D4" w:sz="4"/>
@@ -8912,7 +8912,7 @@
         </w:trPr>
         <w:tc>
           <w:tcPr>
-            <w:tcW w:type="dxa" w:w="2675"/>
+            <w:tcW w:type="dxa" w:w="2564"/>
             <w:tcBorders>
               <w:top w:val="single" w:color="BFC9D4" w:sz="4"/>
               <w:left w:val="single" w:color="BFC9D4" w:sz="4"/>
@@ -8942,7 +8942,7 @@
         </w:tc>
         <w:tc>
           <w:tcPr>
-            <w:tcW w:type="dxa" w:w="6963"/>
+            <w:tcW w:type="dxa" w:w="7074"/>
             <w:tcBorders>
               <w:top w:val="single" w:color="BFC9D4" w:sz="4"/>
               <w:left w:val="single" w:color="BFC9D4" w:sz="4"/>
@@ -8978,7 +8978,7 @@
         </w:trPr>
         <w:tc>
           <w:tcPr>
-            <w:tcW w:type="dxa" w:w="2675"/>
+            <w:tcW w:type="dxa" w:w="2564"/>
             <w:tcBorders>
               <w:top w:val="single" w:color="BFC9D4" w:sz="4"/>
               <w:left w:val="single" w:color="BFC9D4" w:sz="4"/>
@@ -9007,7 +9007,7 @@
         </w:tc>
         <w:tc>
           <w:tcPr>
-            <w:tcW w:type="dxa" w:w="6963"/>
+            <w:tcW w:type="dxa" w:w="7074"/>
             <w:tcBorders>
               <w:top w:val="single" w:color="BFC9D4" w:sz="4"/>
               <w:left w:val="single" w:color="BFC9D4" w:sz="4"/>
@@ -9042,7 +9042,7 @@
         </w:trPr>
         <w:tc>
           <w:tcPr>
-            <w:tcW w:type="dxa" w:w="2675"/>
+            <w:tcW w:type="dxa" w:w="2564"/>
             <w:tcBorders>
               <w:top w:val="single" w:color="BFC9D4" w:sz="4"/>
               <w:left w:val="single" w:color="BFC9D4" w:sz="4"/>
@@ -9072,7 +9072,7 @@
         </w:tc>
         <w:tc>
           <w:tcPr>
-            <w:tcW w:type="dxa" w:w="6963"/>
+            <w:tcW w:type="dxa" w:w="7074"/>
             <w:tcBorders>
               <w:top w:val="single" w:color="BFC9D4" w:sz="4"/>
               <w:left w:val="single" w:color="BFC9D4" w:sz="4"/>
@@ -9108,7 +9108,7 @@
         </w:trPr>
         <w:tc>
           <w:tcPr>
-            <w:tcW w:type="dxa" w:w="2675"/>
+            <w:tcW w:type="dxa" w:w="2564"/>
             <w:tcBorders>
               <w:top w:val="single" w:color="BFC9D4" w:sz="4"/>
               <w:left w:val="single" w:color="BFC9D4" w:sz="4"/>
@@ -9137,7 +9137,7 @@
         </w:tc>
         <w:tc>
           <w:tcPr>
-            <w:tcW w:type="dxa" w:w="6963"/>
+            <w:tcW w:type="dxa" w:w="7074"/>
             <w:tcBorders>
               <w:top w:val="single" w:color="BFC9D4" w:sz="4"/>
               <w:left w:val="single" w:color="BFC9D4" w:sz="4"/>

</xml_diff>